<commit_message>
Fluid simulation update and  link update
Co-authored-by: Copilot <copilot@github.com>
</commit_message>
<xml_diff>
--- a/public/resumes/Roys_Resume.docx
+++ b/public/resumes/Roys_Resume.docx
@@ -21,6 +21,7 @@
     </w:p>
     <w:p>
       <w:pPr>
+        <w:spacing w:line="240" w:lineRule="auto"/>
         <w:rPr>
           <w:rFonts w:ascii="Calibri" w:hAnsi="Calibri"/>
         </w:rPr>
@@ -46,6 +47,7 @@
     </w:p>
     <w:p>
       <w:pPr>
+        <w:spacing w:line="240" w:lineRule="auto"/>
         <w:rPr>
           <w:rFonts w:ascii="Calibri" w:hAnsi="Calibri"/>
         </w:rPr>
@@ -54,7 +56,19 @@
         <w:rPr>
           <w:rFonts w:ascii="Calibri" w:hAnsi="Calibri"/>
         </w:rPr>
-        <w:t xml:space="preserve">Phone: +91 9846666988 | Email: roysak@gmail.com | LinkedIn: </w:t>
+        <w:t>Phone: +91 9846666988 | Email: roysak@gmail.com</w:t>
+      </w:r>
+      <w:r>
+        <w:rPr>
+          <w:rFonts w:ascii="Calibri" w:hAnsi="Calibri"/>
+        </w:rPr>
+        <w:br/>
+      </w:r>
+      <w:r>
+        <w:rPr>
+          <w:rFonts w:ascii="Calibri" w:hAnsi="Calibri"/>
+        </w:rPr>
+        <w:t xml:space="preserve">LinkedIn: </w:t>
       </w:r>
       <w:hyperlink r:id="rId6" w:history="1">
         <w:r>
@@ -65,6 +79,38 @@
           <w:t>https://in.linkedin.com/in/roysak</w:t>
         </w:r>
       </w:hyperlink>
+      <w:r>
+        <w:t xml:space="preserve">  |  </w:t>
+      </w:r>
+      <w:r>
+        <w:rPr>
+          <w:rFonts w:ascii="Calibri" w:hAnsi="Calibri"/>
+        </w:rPr>
+        <w:t xml:space="preserve">Website: </w:t>
+      </w:r>
+      <w:hyperlink r:id="rId7" w:history="1">
+        <w:r>
+          <w:rPr>
+            <w:rStyle w:val="Hyperlink"/>
+            <w:rFonts w:ascii="Calibri" w:hAnsi="Calibri"/>
+          </w:rPr>
+          <w:t>https://roy</w:t>
+        </w:r>
+        <w:r>
+          <w:rPr>
+            <w:rStyle w:val="Hyperlink"/>
+            <w:rFonts w:ascii="Calibri" w:hAnsi="Calibri"/>
+          </w:rPr>
+          <w:t>s</w:t>
+        </w:r>
+        <w:r>
+          <w:rPr>
+            <w:rStyle w:val="Hyperlink"/>
+            <w:rFonts w:ascii="Calibri" w:hAnsi="Calibri"/>
+          </w:rPr>
+          <w:t>ak.in</w:t>
+        </w:r>
+      </w:hyperlink>
     </w:p>
     <w:p>
       <w:pPr>
@@ -77,7 +123,6 @@
     <w:p>
       <w:pPr>
         <w:pStyle w:val="Heading2"/>
-        <w:spacing w:line="360" w:lineRule="auto"/>
       </w:pPr>
       <w:r>
         <w:t>SUMMARY</w:t>
@@ -107,7 +152,6 @@
     <w:p>
       <w:pPr>
         <w:pStyle w:val="Heading2"/>
-        <w:spacing w:line="360" w:lineRule="auto"/>
       </w:pPr>
       <w:r>
         <w:t>KEY ACHIEVEMENTS</w:t>
@@ -176,7 +220,6 @@
     <w:p>
       <w:pPr>
         <w:pStyle w:val="Heading2"/>
-        <w:spacing w:line="360" w:lineRule="auto"/>
       </w:pPr>
       <w:r>
         <w:t>SKILLS</w:t>
@@ -282,6 +325,7 @@
     </w:p>
     <w:p>
       <w:pPr>
+        <w:spacing w:line="240" w:lineRule="auto"/>
         <w:rPr>
           <w:rFonts w:ascii="Calibri" w:hAnsi="Calibri"/>
         </w:rPr>
@@ -290,7 +334,6 @@
     <w:p>
       <w:pPr>
         <w:pStyle w:val="Heading2"/>
-        <w:spacing w:line="360" w:lineRule="auto"/>
       </w:pPr>
       <w:r>
         <w:t>EXPERIENCE</w:t>
@@ -346,15 +389,7 @@
           <w:b/>
           <w:bCs/>
         </w:rPr>
-        <w:t>latform</w:t>
-      </w:r>
-      <w:r>
-        <w:rPr>
-          <w:rFonts w:ascii="Calibri" w:hAnsi="Calibri"/>
-          <w:b/>
-          <w:bCs/>
-        </w:rPr>
-        <w:t xml:space="preserve"> </w:t>
+        <w:t xml:space="preserve">latform </w:t>
       </w:r>
       <w:r>
         <w:rPr>

</xml_diff>